<commit_message>
Tier 3: preserve semantic character formatting
Carry sub/superscript (x², H₂O — meaning, not styling) on every block, plus
underline and strikethrough as inline emphasis (kept in Body/List/Quote,
dropped when uniform like bold/italic). Segment gains superscript/subscript/
underline/strike; ingest reads them from run fonts (coercing WD_UNDERLINE
enums to bool); apply emits them. Rich fixture + regression test extended.

Co-Authored-By: Claude Opus 4.8 <noreply@anthropic.com>
Claude-Session: https://claude.ai/code/session_01BvgzKunMkki5Tsy6AF6w8S
</commit_message>
<xml_diff>
--- a/samples/input_rich.docx
+++ b/samples/input_rich.docx
@@ -319,6 +319,53 @@
       </w:r>
       <w:r>
         <w:t xml:space="preserve"> with the silkscreen arrow before fastening.</w:t>
+      </w:r>
+    </w:p>
+    <w:p>
+      <w:r>
+        <w:t xml:space="preserve">The coolant is </w:t>
+      </w:r>
+      <w:r>
+        <w:t>H</w:t>
+      </w:r>
+      <w:r>
+        <w:rPr>
+          <w:vertAlign w:val="subscript"/>
+        </w:rPr>
+        <w:t>2</w:t>
+      </w:r>
+      <w:r>
+        <w:t xml:space="preserve">O; dissipation scales with </w:t>
+      </w:r>
+      <w:r>
+        <w:t>v</w:t>
+      </w:r>
+      <w:r>
+        <w:rPr>
+          <w:vertAlign w:val="superscript"/>
+        </w:rPr>
+        <w:t>2</w:t>
+      </w:r>
+      <w:r>
+        <w:t xml:space="preserve">. The </w:t>
+      </w:r>
+      <w:r>
+        <w:rPr>
+          <w:u w:val="single"/>
+        </w:rPr>
+        <w:t>thermal budget</w:t>
+      </w:r>
+      <w:r>
+        <w:t xml:space="preserve"> is fixed; the </w:t>
+      </w:r>
+      <w:r>
+        <w:rPr>
+          <w:strike/>
+        </w:rPr>
+        <w:t>old 5 W limit</w:t>
+      </w:r>
+      <w:r>
+        <w:t xml:space="preserve"> no longer applies.</w:t>
       </w:r>
     </w:p>
     <w:sectPr>

</xml_diff>

<commit_message>
Tier 4: carry highlighter marks as author annotations
Highlight (w:highlight) is a manual author mark, not template styling, so it is
now carried like other inline emphasis. Segment gains a highlight field; ingest
reads the run's direct highlight colour; apply re-emits it (always preserved —
never treated as decorative). Rich fixture + regression test extended; docs
updated (README, BUILD_STATUS, CHANGELOG, backlog).

Co-Authored-By: Claude Opus 4.8 <noreply@anthropic.com>
Claude-Session: https://claude.ai/code/session_01BvgzKunMkki5Tsy6AF6w8S
</commit_message>
<xml_diff>
--- a/samples/input_rich.docx
+++ b/samples/input_rich.docx
@@ -365,7 +365,13 @@
         <w:t>old 5 W limit</w:t>
       </w:r>
       <w:r>
-        <w:t xml:space="preserve"> no longer applies.</w:t>
+        <w:t xml:space="preserve"> no longer applies. </w:t>
+      </w:r>
+      <w:r>
+        <w:rPr>
+          <w:highlight w:val="yellow"/>
+        </w:rPr>
+        <w:t>Confirm the tolerance</w:t>
       </w:r>
     </w:p>
     <w:sectPr>

</xml_diff>